<commit_message>
Update resume files; add Office temp file
Modify Sahil_SDE (2).docx and resume.pdf (binary changes). Add Office temporary lock file '~$hil_SDE (2).docx' (likely an editor temp file). Suggest removing the temp file and adding a gitignore entry for Office temp files (e.g. ~\$* or ~* ) to avoid committing editor artifacts.
</commit_message>
<xml_diff>
--- a/Sahil_SDE (2).docx
+++ b/Sahil_SDE (2).docx
@@ -15,7 +15,76 @@
           <w:sz w:val="36"/>
           <w:szCs w:val="36"/>
         </w:rPr>
-        <w:t>SAHIL MUNGARA</w:t>
+        <w:fldChar w:fldCharType="begin"/>
+      </w:r>
+      <w:r>
+        <w:rPr>
+          <w:b/>
+          <w:bCs/>
+          <w:color w:val="1E3A5F"/>
+          <w:sz w:val="36"/>
+          <w:szCs w:val="36"/>
+        </w:rPr>
+        <w:instrText>HYPERLINK "https://sahilmungara.netlify.app"</w:instrText>
+      </w:r>
+      <w:r>
+        <w:rPr>
+          <w:b/>
+          <w:bCs/>
+          <w:color w:val="1E3A5F"/>
+          <w:sz w:val="36"/>
+          <w:szCs w:val="36"/>
+        </w:rPr>
+      </w:r>
+      <w:r>
+        <w:rPr>
+          <w:b/>
+          <w:bCs/>
+          <w:color w:val="1E3A5F"/>
+          <w:sz w:val="36"/>
+          <w:szCs w:val="36"/>
+        </w:rPr>
+        <w:fldChar w:fldCharType="separate"/>
+      </w:r>
+      <w:r>
+        <w:rPr>
+          <w:rStyle w:val="Hyperlink"/>
+          <w:b/>
+          <w:bCs/>
+          <w:sz w:val="36"/>
+          <w:szCs w:val="36"/>
+        </w:rPr>
+        <w:t>SAHI</w:t>
+      </w:r>
+      <w:r>
+        <w:rPr>
+          <w:rStyle w:val="Hyperlink"/>
+          <w:b/>
+          <w:bCs/>
+          <w:sz w:val="36"/>
+          <w:szCs w:val="36"/>
+        </w:rPr>
+        <w:t>L</w:t>
+      </w:r>
+      <w:r>
+        <w:rPr>
+          <w:rStyle w:val="Hyperlink"/>
+          <w:b/>
+          <w:bCs/>
+          <w:sz w:val="36"/>
+          <w:szCs w:val="36"/>
+        </w:rPr>
+        <w:t xml:space="preserve"> MUNGARA</w:t>
+      </w:r>
+      <w:r>
+        <w:rPr>
+          <w:b/>
+          <w:bCs/>
+          <w:color w:val="1E3A5F"/>
+          <w:sz w:val="36"/>
+          <w:szCs w:val="36"/>
+        </w:rPr>
+        <w:fldChar w:fldCharType="end"/>
       </w:r>
     </w:p>
     <w:p>
@@ -24,7 +93,23 @@
         <w:jc w:val="center"/>
       </w:pPr>
       <w:r>
-        <w:t xml:space="preserve">Rajkot, Gujarat, India  |  +91-9484844090  |  </w:t>
+        <w:t xml:space="preserve">Rajkot, Gujarat, </w:t>
+      </w:r>
+      <w:proofErr w:type="gramStart"/>
+      <w:r>
+        <w:t>India  |</w:t>
+      </w:r>
+      <w:proofErr w:type="gramEnd"/>
+      <w:r>
+        <w:t xml:space="preserve">  +91-</w:t>
+      </w:r>
+      <w:proofErr w:type="gramStart"/>
+      <w:r>
+        <w:t>9484844090  |</w:t>
+      </w:r>
+      <w:proofErr w:type="gramEnd"/>
+      <w:r>
+        <w:t xml:space="preserve">  </w:t>
       </w:r>
       <w:hyperlink r:id="rId6" w:history="1">
         <w:r>
@@ -476,12 +561,21 @@
       <w:pPr>
         <w:spacing w:before="100" w:after="30"/>
       </w:pPr>
-      <w:r>
-        <w:rPr>
-          <w:b/>
-          <w:bCs/>
-        </w:rPr>
-        <w:t xml:space="preserve">Open Source Contributor — </w:t>
+      <w:proofErr w:type="gramStart"/>
+      <w:r>
+        <w:rPr>
+          <w:b/>
+          <w:bCs/>
+        </w:rPr>
+        <w:t>Open Source</w:t>
+      </w:r>
+      <w:proofErr w:type="gramEnd"/>
+      <w:r>
+        <w:rPr>
+          <w:b/>
+          <w:bCs/>
+        </w:rPr>
+        <w:t xml:space="preserve"> Contributor — </w:t>
       </w:r>
       <w:proofErr w:type="spellStart"/>
       <w:r>
@@ -531,7 +625,15 @@
         <w:spacing w:before="20" w:after="20"/>
       </w:pPr>
       <w:r>
-        <w:t>Reduced codebase bug count by 20% across contributed projects through systematic debugging, code review participation, and regression testing.</w:t>
+        <w:t xml:space="preserve">Reduced codebase bug </w:t>
+      </w:r>
+      <w:proofErr w:type="gramStart"/>
+      <w:r>
+        <w:t>count</w:t>
+      </w:r>
+      <w:proofErr w:type="gramEnd"/>
+      <w:r>
+        <w:t xml:space="preserve"> by 20% across contributed projects through systematic debugging, code review participation, and regression testing.</w:t>
       </w:r>
     </w:p>
     <w:p>
@@ -636,10 +738,38 @@
           <w:b/>
           <w:bCs/>
         </w:rPr>
-        <w:t>B.E. Computer Engineering</w:t>
-      </w:r>
-      <w:r>
-        <w:t xml:space="preserve">  |  Gujarat Technological University (GEC Rajkot)  |  2023 – 2027  |  CGPA: 8.0 / 10</w:t>
+        <w:t xml:space="preserve">B.E. Computer </w:t>
+      </w:r>
+      <w:proofErr w:type="gramStart"/>
+      <w:r>
+        <w:rPr>
+          <w:b/>
+          <w:bCs/>
+        </w:rPr>
+        <w:t>Engineering</w:t>
+      </w:r>
+      <w:r>
+        <w:t xml:space="preserve">  |</w:t>
+      </w:r>
+      <w:proofErr w:type="gramEnd"/>
+      <w:r>
+        <w:t xml:space="preserve">  Gujarat Technological University (GEC </w:t>
+      </w:r>
+      <w:proofErr w:type="gramStart"/>
+      <w:r>
+        <w:t>Rajkot)  |</w:t>
+      </w:r>
+      <w:proofErr w:type="gramEnd"/>
+      <w:r>
+        <w:t xml:space="preserve">  2023 – </w:t>
+      </w:r>
+      <w:proofErr w:type="gramStart"/>
+      <w:r>
+        <w:t>2027  |</w:t>
+      </w:r>
+      <w:proofErr w:type="gramEnd"/>
+      <w:r>
+        <w:t xml:space="preserve">  CGPA: 8.0 / 10</w:t>
       </w:r>
     </w:p>
     <w:p>
@@ -668,10 +798,30 @@
           <w:b/>
           <w:bCs/>
         </w:rPr>
-        <w:t>Postman API Fundamentals Student Expert</w:t>
-      </w:r>
-      <w:r>
-        <w:t xml:space="preserve">  |  Postman  |  Oct 2024</w:t>
+        <w:t xml:space="preserve">Postman API Fundamentals Student </w:t>
+      </w:r>
+      <w:proofErr w:type="gramStart"/>
+      <w:r>
+        <w:rPr>
+          <w:b/>
+          <w:bCs/>
+        </w:rPr>
+        <w:t>Expert</w:t>
+      </w:r>
+      <w:r>
+        <w:t xml:space="preserve">  |</w:t>
+      </w:r>
+      <w:proofErr w:type="gramEnd"/>
+      <w:r>
+        <w:t xml:space="preserve">  </w:t>
+      </w:r>
+      <w:proofErr w:type="gramStart"/>
+      <w:r>
+        <w:t>Postman  |</w:t>
+      </w:r>
+      <w:proofErr w:type="gramEnd"/>
+      <w:r>
+        <w:t xml:space="preserve">  Oct 2024</w:t>
       </w:r>
     </w:p>
     <w:p>
@@ -683,18 +833,35 @@
           <w:b/>
           <w:bCs/>
         </w:rPr>
-        <w:t>Responsive Web Design</w:t>
-      </w:r>
-      <w:r>
-        <w:t xml:space="preserve">  |  </w:t>
+        <w:t xml:space="preserve">Responsive Web </w:t>
+      </w:r>
+      <w:proofErr w:type="gramStart"/>
+      <w:r>
+        <w:rPr>
+          <w:b/>
+          <w:bCs/>
+        </w:rPr>
+        <w:t>Design</w:t>
+      </w:r>
+      <w:r>
+        <w:t xml:space="preserve">  |</w:t>
+      </w:r>
+      <w:proofErr w:type="gramEnd"/>
+      <w:r>
+        <w:t xml:space="preserve">  </w:t>
       </w:r>
       <w:proofErr w:type="spellStart"/>
+      <w:proofErr w:type="gramStart"/>
       <w:r>
         <w:t>freeCodeCamp</w:t>
       </w:r>
       <w:proofErr w:type="spellEnd"/>
       <w:r>
-        <w:t xml:space="preserve">  |  Sep 2024</w:t>
+        <w:t xml:space="preserve">  |</w:t>
+      </w:r>
+      <w:proofErr w:type="gramEnd"/>
+      <w:r>
+        <w:t xml:space="preserve">  Sep 2024</w:t>
       </w:r>
     </w:p>
     <w:p>
@@ -719,7 +886,23 @@
         <w:spacing w:before="60" w:after="60"/>
       </w:pPr>
       <w:r>
-        <w:t>English (Professional)  |  Hindi (Professional)  |  Gujarati (Native)</w:t>
+        <w:t>English (</w:t>
+      </w:r>
+      <w:proofErr w:type="gramStart"/>
+      <w:r>
+        <w:t>Professional)  |</w:t>
+      </w:r>
+      <w:proofErr w:type="gramEnd"/>
+      <w:r>
+        <w:t xml:space="preserve">  Hindi (</w:t>
+      </w:r>
+      <w:proofErr w:type="gramStart"/>
+      <w:r>
+        <w:t>Professional)  |</w:t>
+      </w:r>
+      <w:proofErr w:type="gramEnd"/>
+      <w:r>
+        <w:t xml:space="preserve">  Gujarati (Native)</w:t>
       </w:r>
     </w:p>
     <w:sectPr>
@@ -1477,6 +1660,30 @@
       <w:szCs w:val="20"/>
     </w:rPr>
   </w:style>
+  <w:style w:type="character" w:styleId="UnresolvedMention">
+    <w:name w:val="Unresolved Mention"/>
+    <w:basedOn w:val="DefaultParagraphFont"/>
+    <w:uiPriority w:val="99"/>
+    <w:semiHidden/>
+    <w:unhideWhenUsed/>
+    <w:rsid w:val="006375C3"/>
+    <w:rPr>
+      <w:color w:val="605E5C"/>
+      <w:shd w:val="clear" w:color="auto" w:fill="E1DFDD"/>
+    </w:rPr>
+  </w:style>
+  <w:style w:type="character" w:styleId="FollowedHyperlink">
+    <w:name w:val="FollowedHyperlink"/>
+    <w:basedOn w:val="DefaultParagraphFont"/>
+    <w:uiPriority w:val="99"/>
+    <w:semiHidden/>
+    <w:unhideWhenUsed/>
+    <w:rsid w:val="006375C3"/>
+    <w:rPr>
+      <w:color w:val="954F72" w:themeColor="followedHyperlink"/>
+      <w:u w:val="single"/>
+    </w:rPr>
+  </w:style>
 </w:styles>
 </file>
 

</xml_diff>